<commit_message>
chore: remove .skills, .claude, and .agents directories
</commit_message>
<xml_diff>
--- a/SEM 3/Data structures using c/chapter 1.docx
+++ b/SEM 3/Data structures using c/chapter 1.docx
@@ -1,6 +1,6 @@
 
 <file path=word/document.xml><?xml version="1.0" encoding="utf-8"?>
-<w:document xmlns:wpc="http://schemas.microsoft.com/office/word/2010/wordprocessingCanvas" xmlns:cx="http://schemas.microsoft.com/office/drawing/2014/chartex" xmlns:cx1="http://schemas.microsoft.com/office/drawing/2015/9/8/chartex" xmlns:cx2="http://schemas.microsoft.com/office/drawing/2015/10/21/chartex" xmlns:cx3="http://schemas.microsoft.com/office/drawing/2016/5/9/chartex" xmlns:cx4="http://schemas.microsoft.com/office/drawing/2016/5/10/chartex" xmlns:cx5="http://schemas.microsoft.com/office/drawing/2016/5/11/chartex" xmlns:cx6="http://schemas.microsoft.com/office/drawing/2016/5/12/chartex" xmlns:cx7="http://schemas.microsoft.com/office/drawing/2016/5/13/chartex" xmlns:cx8="http://schemas.microsoft.com/office/drawing/2016/5/14/chartex" xmlns:mc="http://schemas.openxmlformats.org/markup-compatibility/2006" xmlns:aink="http://schemas.microsoft.com/office/drawing/2016/ink" xmlns:am3d="http://schemas.microsoft.com/office/drawing/2017/model3d" xmlns:o="urn:schemas-microsoft-com:office:office" xmlns:oel="http://schemas.microsoft.com/office/2019/extlst" xmlns:r="http://schemas.openxmlformats.org/officeDocument/2006/relationships" xmlns:m="http://schemas.openxmlformats.org/officeDocument/2006/math" xmlns:v="urn:schemas-microsoft-com:vml" xmlns:wp14="http://schemas.microsoft.com/office/word/2010/wordprocessingDrawing" xmlns:wp="http://schemas.openxmlformats.org/drawingml/2006/wordprocessingDrawing" xmlns:w10="urn:schemas-microsoft-com:office:word" xmlns:w="http://schemas.openxmlformats.org/wordprocessingml/2006/main" xmlns:w14="http://schemas.microsoft.com/office/word/2010/wordml" xmlns:w15="http://schemas.microsoft.com/office/word/2012/wordml" xmlns:w16cex="http://schemas.microsoft.com/office/word/2018/wordml/cex" xmlns:w16cid="http://schemas.microsoft.com/office/word/2016/wordml/cid" xmlns:w16="http://schemas.microsoft.com/office/word/2018/wordml" xmlns:w16sdtdh="http://schemas.microsoft.com/office/word/2020/wordml/sdtdatahash" xmlns:w16se="http://schemas.microsoft.com/office/word/2015/wordml/symex" xmlns:wpg="http://schemas.microsoft.com/office/word/2010/wordprocessingGroup" xmlns:wpi="http://schemas.microsoft.com/office/word/2010/wordprocessingInk" xmlns:wne="http://schemas.microsoft.com/office/word/2006/wordml" xmlns:wps="http://schemas.microsoft.com/office/word/2010/wordprocessingShape" mc:Ignorable="w14 w15 w16se w16cid w16 w16cex w16sdtdh wp14">
+<w:document xmlns:wpc="http://schemas.microsoft.com/office/word/2010/wordprocessingCanvas" xmlns:cx="http://schemas.microsoft.com/office/drawing/2014/chartex" xmlns:cx1="http://schemas.microsoft.com/office/drawing/2015/9/8/chartex" xmlns:cx2="http://schemas.microsoft.com/office/drawing/2015/10/21/chartex" xmlns:cx3="http://schemas.microsoft.com/office/drawing/2016/5/9/chartex" xmlns:cx4="http://schemas.microsoft.com/office/drawing/2016/5/10/chartex" xmlns:cx5="http://schemas.microsoft.com/office/drawing/2016/5/11/chartex" xmlns:cx6="http://schemas.microsoft.com/office/drawing/2016/5/12/chartex" xmlns:cx7="http://schemas.microsoft.com/office/drawing/2016/5/13/chartex" xmlns:cx8="http://schemas.microsoft.com/office/drawing/2016/5/14/chartex" xmlns:mc="http://schemas.openxmlformats.org/markup-compatibility/2006" xmlns:m="http://schemas.openxmlformats.org/officeDocument/2006/math" xmlns:aink="http://schemas.microsoft.com/office/drawing/2016/ink" xmlns:am3d="http://schemas.microsoft.com/office/drawing/2017/model3d" xmlns:oel="http://schemas.microsoft.com/office/2019/extlst" xmlns:r="http://schemas.openxmlformats.org/officeDocument/2006/relationships" xmlns:wp14="http://schemas.microsoft.com/office/word/2010/wordprocessingDrawing" xmlns:wp="http://schemas.openxmlformats.org/drawingml/2006/wordprocessingDrawing" xmlns:wpg="http://schemas.microsoft.com/office/word/2010/wordprocessingGroup" xmlns:wpi="http://schemas.microsoft.com/office/word/2010/wordprocessingInk" xmlns:wps="http://schemas.microsoft.com/office/word/2010/wordprocessingShape" xmlns:o="urn:schemas-microsoft-com:office:office" xmlns:v="urn:schemas-microsoft-com:vml" xmlns:w10="urn:schemas-microsoft-com:office:word" xmlns:w="http://schemas.openxmlformats.org/wordprocessingml/2006/main" xmlns:w14="http://schemas.microsoft.com/office/word/2010/wordml" xmlns:w15="http://schemas.microsoft.com/office/word/2012/wordml" xmlns:w16cex="http://schemas.microsoft.com/office/word/2018/wordml/cex" xmlns:w16cid="http://schemas.microsoft.com/office/word/2016/wordml/cid" xmlns:w16="http://schemas.microsoft.com/office/word/2018/wordml" xmlns:w16sdtdh="http://schemas.microsoft.com/office/word/2020/wordml/sdtdatahash" xmlns:w16sdtfl="http://schemas.microsoft.com/office/word/2024/wordml/sdtformatlock" xmlns:w16se="http://schemas.microsoft.com/office/word/2015/wordml/symex" xmlns:w16du="http://schemas.microsoft.com/office/word/2023/wordml/word16du" xmlns:wne="http://schemas.microsoft.com/office/word/2006/wordml" mc:Ignorable="w14 w15 w16se w16cid w16 w16cex w16sdtdh w16sdtfl w16du wp14">
   <w:body>
     <w:p>
       <w:pPr>
@@ -480,6 +480,26 @@
         <w:jc w:val="both"/>
         <w:rPr>
           <w:rFonts w:ascii="Times New Roman" w:eastAsia="Times New Roman" w:hAnsi="Times New Roman" w:cs="Times New Roman"/>
+          <w:sz w:val="24"/>
+          <w:szCs w:val="24"/>
+        </w:rPr>
+      </w:pPr>
+      <w:r>
+        <w:rPr>
+          <w:rFonts w:ascii="Times New Roman" w:eastAsia="Times New Roman" w:hAnsi="Times New Roman" w:cs="Times New Roman"/>
+          <w:sz w:val="24"/>
+          <w:szCs w:val="24"/>
+        </w:rPr>
+        <w:t xml:space="preserve">And make it work </w:t>
+      </w:r>
+    </w:p>
+    <w:p>
+      <w:pPr>
+        <w:shd w:val="clear" w:color="auto" w:fill="FFFFFF"/>
+        <w:spacing w:line="240" w:lineRule="auto"/>
+        <w:jc w:val="both"/>
+        <w:rPr>
+          <w:rFonts w:ascii="Times New Roman" w:eastAsia="Times New Roman" w:hAnsi="Times New Roman" w:cs="Times New Roman"/>
           <w:b/>
           <w:bCs/>
           <w:sz w:val="28"/>
@@ -522,7 +542,6 @@
           <w:sz w:val="28"/>
           <w:szCs w:val="28"/>
         </w:rPr>
-        <w:lastRenderedPageBreak/>
         <w:t>Abstract Data type:</w:t>
       </w:r>
     </w:p>
@@ -1244,7 +1263,498 @@
           <w:sz w:val="24"/>
           <w:szCs w:val="24"/>
         </w:rPr>
-        <w:t xml:space="preserve"> An array is a collection of similar type of data items and each data item is called an element of the array. The data type of the element may be any valid data type like char, </w:t>
+        <w:t> An array is a collection of similar type of data items and each data item is called an element of the array. The data type of the element may be any valid data type like char, int, float or double.</w:t>
+      </w:r>
+    </w:p>
+    <w:p>
+      <w:pPr>
+        <w:shd w:val="clear" w:color="auto" w:fill="FFFFFF"/>
+        <w:spacing w:line="240" w:lineRule="auto"/>
+        <w:jc w:val="both"/>
+        <w:rPr>
+          <w:rFonts w:ascii="Times New Roman" w:eastAsia="Times New Roman" w:hAnsi="Times New Roman" w:cs="Times New Roman"/>
+          <w:sz w:val="24"/>
+          <w:szCs w:val="24"/>
+        </w:rPr>
+      </w:pPr>
+      <w:r>
+        <w:rPr>
+          <w:rFonts w:ascii="Times New Roman" w:eastAsia="Times New Roman" w:hAnsi="Times New Roman" w:cs="Times New Roman"/>
+          <w:sz w:val="24"/>
+          <w:szCs w:val="24"/>
+        </w:rPr>
+        <w:t>The elements of array share the same variable name but each one carries a different index number known as subscript. The array can be one dimensional, two dimensional or multidimensional.</w:t>
+      </w:r>
+    </w:p>
+    <w:p>
+      <w:pPr>
+        <w:shd w:val="clear" w:color="auto" w:fill="FFFFFF"/>
+        <w:spacing w:line="240" w:lineRule="auto"/>
+        <w:jc w:val="both"/>
+        <w:rPr>
+          <w:rFonts w:ascii="Times New Roman" w:eastAsia="Times New Roman" w:hAnsi="Times New Roman" w:cs="Times New Roman"/>
+          <w:sz w:val="24"/>
+          <w:szCs w:val="24"/>
+        </w:rPr>
+      </w:pPr>
+      <w:r>
+        <w:rPr>
+          <w:rFonts w:ascii="Times New Roman" w:eastAsia="Times New Roman" w:hAnsi="Times New Roman" w:cs="Times New Roman"/>
+          <w:sz w:val="24"/>
+          <w:szCs w:val="24"/>
+        </w:rPr>
+        <w:lastRenderedPageBreak/>
+        <w:t>The individual elements of the array age are:</w:t>
+      </w:r>
+    </w:p>
+    <w:p>
+      <w:pPr>
+        <w:shd w:val="clear" w:color="auto" w:fill="FFFFFF"/>
+        <w:spacing w:line="240" w:lineRule="auto"/>
+        <w:jc w:val="both"/>
+        <w:rPr>
+          <w:rFonts w:ascii="Times New Roman" w:eastAsia="Times New Roman" w:hAnsi="Times New Roman" w:cs="Times New Roman"/>
+          <w:sz w:val="24"/>
+          <w:szCs w:val="24"/>
+        </w:rPr>
+      </w:pPr>
+      <w:proofErr w:type="gramStart"/>
+      <w:r>
+        <w:rPr>
+          <w:rFonts w:ascii="Times New Roman" w:eastAsia="Times New Roman" w:hAnsi="Times New Roman" w:cs="Times New Roman"/>
+          <w:sz w:val="24"/>
+          <w:szCs w:val="24"/>
+        </w:rPr>
+        <w:t>age[</w:t>
+      </w:r>
+      <w:proofErr w:type="gramEnd"/>
+      <w:r>
+        <w:rPr>
+          <w:rFonts w:ascii="Times New Roman" w:eastAsia="Times New Roman" w:hAnsi="Times New Roman" w:cs="Times New Roman"/>
+          <w:sz w:val="24"/>
+          <w:szCs w:val="24"/>
+        </w:rPr>
+        <w:t xml:space="preserve">0], </w:t>
+      </w:r>
+      <w:proofErr w:type="gramStart"/>
+      <w:r>
+        <w:rPr>
+          <w:rFonts w:ascii="Times New Roman" w:eastAsia="Times New Roman" w:hAnsi="Times New Roman" w:cs="Times New Roman"/>
+          <w:sz w:val="24"/>
+          <w:szCs w:val="24"/>
+        </w:rPr>
+        <w:t>age[</w:t>
+      </w:r>
+      <w:proofErr w:type="gramEnd"/>
+      <w:r>
+        <w:rPr>
+          <w:rFonts w:ascii="Times New Roman" w:eastAsia="Times New Roman" w:hAnsi="Times New Roman" w:cs="Times New Roman"/>
+          <w:sz w:val="24"/>
+          <w:szCs w:val="24"/>
+        </w:rPr>
+        <w:t xml:space="preserve">1], </w:t>
+      </w:r>
+      <w:proofErr w:type="gramStart"/>
+      <w:r>
+        <w:rPr>
+          <w:rFonts w:ascii="Times New Roman" w:eastAsia="Times New Roman" w:hAnsi="Times New Roman" w:cs="Times New Roman"/>
+          <w:sz w:val="24"/>
+          <w:szCs w:val="24"/>
+        </w:rPr>
+        <w:t>age[</w:t>
+      </w:r>
+      <w:proofErr w:type="gramEnd"/>
+      <w:r>
+        <w:rPr>
+          <w:rFonts w:ascii="Times New Roman" w:eastAsia="Times New Roman" w:hAnsi="Times New Roman" w:cs="Times New Roman"/>
+          <w:sz w:val="24"/>
+          <w:szCs w:val="24"/>
+        </w:rPr>
+        <w:t xml:space="preserve">2], </w:t>
+      </w:r>
+      <w:proofErr w:type="gramStart"/>
+      <w:r>
+        <w:rPr>
+          <w:rFonts w:ascii="Times New Roman" w:eastAsia="Times New Roman" w:hAnsi="Times New Roman" w:cs="Times New Roman"/>
+          <w:sz w:val="24"/>
+          <w:szCs w:val="24"/>
+        </w:rPr>
+        <w:t>age[</w:t>
+      </w:r>
+      <w:proofErr w:type="gramEnd"/>
+      <w:r>
+        <w:rPr>
+          <w:rFonts w:ascii="Times New Roman" w:eastAsia="Times New Roman" w:hAnsi="Times New Roman" w:cs="Times New Roman"/>
+          <w:sz w:val="24"/>
+          <w:szCs w:val="24"/>
+        </w:rPr>
+        <w:t>3</w:t>
+      </w:r>
+      <w:proofErr w:type="gramStart"/>
+      <w:r>
+        <w:rPr>
+          <w:rFonts w:ascii="Times New Roman" w:eastAsia="Times New Roman" w:hAnsi="Times New Roman" w:cs="Times New Roman"/>
+          <w:sz w:val="24"/>
+          <w:szCs w:val="24"/>
+        </w:rPr>
+        <w:t>],.........</w:t>
+      </w:r>
+      <w:proofErr w:type="gramEnd"/>
+      <w:r>
+        <w:rPr>
+          <w:rFonts w:ascii="Times New Roman" w:eastAsia="Times New Roman" w:hAnsi="Times New Roman" w:cs="Times New Roman"/>
+          <w:sz w:val="24"/>
+          <w:szCs w:val="24"/>
+        </w:rPr>
+        <w:t xml:space="preserve"> </w:t>
+      </w:r>
+      <w:proofErr w:type="gramStart"/>
+      <w:r>
+        <w:rPr>
+          <w:rFonts w:ascii="Times New Roman" w:eastAsia="Times New Roman" w:hAnsi="Times New Roman" w:cs="Times New Roman"/>
+          <w:sz w:val="24"/>
+          <w:szCs w:val="24"/>
+        </w:rPr>
+        <w:t>age[</w:t>
+      </w:r>
+      <w:proofErr w:type="gramEnd"/>
+      <w:r>
+        <w:rPr>
+          <w:rFonts w:ascii="Times New Roman" w:eastAsia="Times New Roman" w:hAnsi="Times New Roman" w:cs="Times New Roman"/>
+          <w:sz w:val="24"/>
+          <w:szCs w:val="24"/>
+        </w:rPr>
+        <w:t xml:space="preserve">98], </w:t>
+      </w:r>
+      <w:proofErr w:type="gramStart"/>
+      <w:r>
+        <w:rPr>
+          <w:rFonts w:ascii="Times New Roman" w:eastAsia="Times New Roman" w:hAnsi="Times New Roman" w:cs="Times New Roman"/>
+          <w:sz w:val="24"/>
+          <w:szCs w:val="24"/>
+        </w:rPr>
+        <w:t>age[</w:t>
+      </w:r>
+      <w:proofErr w:type="gramEnd"/>
+      <w:r>
+        <w:rPr>
+          <w:rFonts w:ascii="Times New Roman" w:eastAsia="Times New Roman" w:hAnsi="Times New Roman" w:cs="Times New Roman"/>
+          <w:sz w:val="24"/>
+          <w:szCs w:val="24"/>
+        </w:rPr>
+        <w:t>99].</w:t>
+      </w:r>
+    </w:p>
+    <w:p>
+      <w:pPr>
+        <w:shd w:val="clear" w:color="auto" w:fill="FFFFFF"/>
+        <w:spacing w:line="240" w:lineRule="auto"/>
+        <w:jc w:val="both"/>
+        <w:rPr>
+          <w:rFonts w:ascii="Times New Roman" w:eastAsia="Times New Roman" w:hAnsi="Times New Roman" w:cs="Times New Roman"/>
+          <w:sz w:val="24"/>
+          <w:szCs w:val="24"/>
+        </w:rPr>
+      </w:pPr>
+      <w:r>
+        <w:rPr>
+          <w:rFonts w:ascii="Times New Roman" w:eastAsia="Times New Roman" w:hAnsi="Times New Roman" w:cs="Times New Roman"/>
+          <w:b/>
+          <w:bCs/>
+          <w:sz w:val="24"/>
+          <w:szCs w:val="24"/>
+        </w:rPr>
+        <w:t>Linked List:</w:t>
+      </w:r>
+      <w:r>
+        <w:rPr>
+          <w:rFonts w:ascii="Times New Roman" w:eastAsia="Times New Roman" w:hAnsi="Times New Roman" w:cs="Times New Roman"/>
+          <w:sz w:val="24"/>
+          <w:szCs w:val="24"/>
+        </w:rPr>
+        <w:t> Linked list is a linear data structure which is used to maintain a list in the memory. It can be seen as the collection of nodes stored at non-contiguous memory locations. Each node of the list contains a pointer to its adjacent node.</w:t>
+      </w:r>
+    </w:p>
+    <w:p>
+      <w:pPr>
+        <w:shd w:val="clear" w:color="auto" w:fill="FFFFFF"/>
+        <w:spacing w:line="240" w:lineRule="auto"/>
+        <w:jc w:val="both"/>
+        <w:rPr>
+          <w:rFonts w:ascii="Times New Roman" w:eastAsia="Times New Roman" w:hAnsi="Times New Roman" w:cs="Times New Roman"/>
+          <w:sz w:val="24"/>
+          <w:szCs w:val="24"/>
+        </w:rPr>
+      </w:pPr>
+      <w:r>
+        <w:rPr>
+          <w:rFonts w:ascii="Times New Roman" w:eastAsia="Times New Roman" w:hAnsi="Times New Roman" w:cs="Times New Roman"/>
+          <w:b/>
+          <w:bCs/>
+          <w:sz w:val="24"/>
+          <w:szCs w:val="24"/>
+        </w:rPr>
+        <w:t>Stack:</w:t>
+      </w:r>
+      <w:r>
+        <w:rPr>
+          <w:rFonts w:ascii="Times New Roman" w:eastAsia="Times New Roman" w:hAnsi="Times New Roman" w:cs="Times New Roman"/>
+          <w:sz w:val="24"/>
+          <w:szCs w:val="24"/>
+        </w:rPr>
+        <w:t> Stack is a linear list in which insertion and deletions are allowed only at one end, called </w:t>
+      </w:r>
+      <w:r>
+        <w:rPr>
+          <w:rFonts w:ascii="Times New Roman" w:eastAsia="Times New Roman" w:hAnsi="Times New Roman" w:cs="Times New Roman"/>
+          <w:b/>
+          <w:bCs/>
+          <w:sz w:val="24"/>
+          <w:szCs w:val="24"/>
+        </w:rPr>
+        <w:t>top</w:t>
+      </w:r>
+      <w:r>
+        <w:rPr>
+          <w:rFonts w:ascii="Times New Roman" w:eastAsia="Times New Roman" w:hAnsi="Times New Roman" w:cs="Times New Roman"/>
+          <w:sz w:val="24"/>
+          <w:szCs w:val="24"/>
+        </w:rPr>
+        <w:t>.</w:t>
+      </w:r>
+    </w:p>
+    <w:p>
+      <w:pPr>
+        <w:shd w:val="clear" w:color="auto" w:fill="FFFFFF"/>
+        <w:spacing w:line="240" w:lineRule="auto"/>
+        <w:jc w:val="both"/>
+        <w:rPr>
+          <w:rFonts w:ascii="Times New Roman" w:eastAsia="Times New Roman" w:hAnsi="Times New Roman" w:cs="Times New Roman"/>
+          <w:sz w:val="24"/>
+          <w:szCs w:val="24"/>
+        </w:rPr>
+      </w:pPr>
+      <w:r>
+        <w:rPr>
+          <w:rFonts w:ascii="Times New Roman" w:eastAsia="Times New Roman" w:hAnsi="Times New Roman" w:cs="Times New Roman"/>
+          <w:sz w:val="24"/>
+          <w:szCs w:val="24"/>
+        </w:rPr>
+        <w:t>A stack is an abstract data type (ADT), can be implemented in most of the programming languages. It is named as stack because it behaves like a real-world stack, for example: - piles of plates or deck of cards etc.</w:t>
+      </w:r>
+    </w:p>
+    <w:p>
+      <w:pPr>
+        <w:shd w:val="clear" w:color="auto" w:fill="FFFFFF"/>
+        <w:spacing w:line="240" w:lineRule="auto"/>
+        <w:jc w:val="both"/>
+        <w:rPr>
+          <w:rFonts w:ascii="Times New Roman" w:eastAsia="Times New Roman" w:hAnsi="Times New Roman" w:cs="Times New Roman"/>
+          <w:sz w:val="24"/>
+          <w:szCs w:val="24"/>
+        </w:rPr>
+      </w:pPr>
+      <w:r>
+        <w:rPr>
+          <w:rFonts w:ascii="Times New Roman" w:eastAsia="Times New Roman" w:hAnsi="Times New Roman" w:cs="Times New Roman"/>
+          <w:b/>
+          <w:bCs/>
+          <w:sz w:val="24"/>
+          <w:szCs w:val="24"/>
+        </w:rPr>
+        <w:t>Queue:</w:t>
+      </w:r>
+      <w:r>
+        <w:rPr>
+          <w:rFonts w:ascii="Times New Roman" w:eastAsia="Times New Roman" w:hAnsi="Times New Roman" w:cs="Times New Roman"/>
+          <w:sz w:val="24"/>
+          <w:szCs w:val="24"/>
+        </w:rPr>
+        <w:t> Queue is a linear list in which elements can be inserted only at one end called </w:t>
+      </w:r>
+      <w:r>
+        <w:rPr>
+          <w:rFonts w:ascii="Times New Roman" w:eastAsia="Times New Roman" w:hAnsi="Times New Roman" w:cs="Times New Roman"/>
+          <w:b/>
+          <w:bCs/>
+          <w:sz w:val="24"/>
+          <w:szCs w:val="24"/>
+        </w:rPr>
+        <w:t>rear</w:t>
+      </w:r>
+      <w:r>
+        <w:rPr>
+          <w:rFonts w:ascii="Times New Roman" w:eastAsia="Times New Roman" w:hAnsi="Times New Roman" w:cs="Times New Roman"/>
+          <w:sz w:val="24"/>
+          <w:szCs w:val="24"/>
+        </w:rPr>
+        <w:t> and deleted only at the other end called </w:t>
+      </w:r>
+      <w:r>
+        <w:rPr>
+          <w:rFonts w:ascii="Times New Roman" w:eastAsia="Times New Roman" w:hAnsi="Times New Roman" w:cs="Times New Roman"/>
+          <w:b/>
+          <w:bCs/>
+          <w:sz w:val="24"/>
+          <w:szCs w:val="24"/>
+        </w:rPr>
+        <w:t>front</w:t>
+      </w:r>
+      <w:r>
+        <w:rPr>
+          <w:rFonts w:ascii="Times New Roman" w:eastAsia="Times New Roman" w:hAnsi="Times New Roman" w:cs="Times New Roman"/>
+          <w:sz w:val="24"/>
+          <w:szCs w:val="24"/>
+        </w:rPr>
+        <w:t>.</w:t>
+      </w:r>
+    </w:p>
+    <w:p>
+      <w:pPr>
+        <w:shd w:val="clear" w:color="auto" w:fill="FFFFFF"/>
+        <w:spacing w:line="240" w:lineRule="auto"/>
+        <w:jc w:val="both"/>
+        <w:rPr>
+          <w:rFonts w:ascii="Times New Roman" w:eastAsia="Times New Roman" w:hAnsi="Times New Roman" w:cs="Times New Roman"/>
+          <w:sz w:val="24"/>
+          <w:szCs w:val="24"/>
+        </w:rPr>
+      </w:pPr>
+      <w:r>
+        <w:rPr>
+          <w:rFonts w:ascii="Times New Roman" w:eastAsia="Times New Roman" w:hAnsi="Times New Roman" w:cs="Times New Roman"/>
+          <w:sz w:val="24"/>
+          <w:szCs w:val="24"/>
+        </w:rPr>
+        <w:t xml:space="preserve">It is an abstract data structure, similar to stack. Queue is opened at both </w:t>
+      </w:r>
+      <w:proofErr w:type="gramStart"/>
+      <w:r>
+        <w:rPr>
+          <w:rFonts w:ascii="Times New Roman" w:eastAsia="Times New Roman" w:hAnsi="Times New Roman" w:cs="Times New Roman"/>
+          <w:sz w:val="24"/>
+          <w:szCs w:val="24"/>
+        </w:rPr>
+        <w:t>end</w:t>
+      </w:r>
+      <w:proofErr w:type="gramEnd"/>
+      <w:r>
+        <w:rPr>
+          <w:rFonts w:ascii="Times New Roman" w:eastAsia="Times New Roman" w:hAnsi="Times New Roman" w:cs="Times New Roman"/>
+          <w:sz w:val="24"/>
+          <w:szCs w:val="24"/>
+        </w:rPr>
+        <w:t xml:space="preserve"> therefore it follows First-In-First-Out (FIFO) methodology for storing the data items.</w:t>
+      </w:r>
+    </w:p>
+    <w:p>
+      <w:pPr>
+        <w:shd w:val="clear" w:color="auto" w:fill="FFFFFF"/>
+        <w:spacing w:line="240" w:lineRule="auto"/>
+        <w:jc w:val="both"/>
+        <w:rPr>
+          <w:rFonts w:ascii="Times New Roman" w:eastAsia="Times New Roman" w:hAnsi="Times New Roman" w:cs="Times New Roman"/>
+          <w:sz w:val="24"/>
+          <w:szCs w:val="24"/>
+        </w:rPr>
+      </w:pPr>
+      <w:proofErr w:type="gramStart"/>
+      <w:r>
+        <w:rPr>
+          <w:rFonts w:ascii="Times New Roman" w:eastAsia="Times New Roman" w:hAnsi="Times New Roman" w:cs="Times New Roman"/>
+          <w:b/>
+          <w:bCs/>
+          <w:sz w:val="24"/>
+          <w:szCs w:val="24"/>
+        </w:rPr>
+        <w:t>Non Linear</w:t>
+      </w:r>
+      <w:proofErr w:type="gramEnd"/>
+      <w:r>
+        <w:rPr>
+          <w:rFonts w:ascii="Times New Roman" w:eastAsia="Times New Roman" w:hAnsi="Times New Roman" w:cs="Times New Roman"/>
+          <w:b/>
+          <w:bCs/>
+          <w:sz w:val="24"/>
+          <w:szCs w:val="24"/>
+        </w:rPr>
+        <w:t xml:space="preserve"> Data Structures:</w:t>
+      </w:r>
+      <w:r>
+        <w:rPr>
+          <w:rFonts w:ascii="Times New Roman" w:eastAsia="Times New Roman" w:hAnsi="Times New Roman" w:cs="Times New Roman"/>
+          <w:sz w:val="24"/>
+          <w:szCs w:val="24"/>
+        </w:rPr>
+        <w:t> This data structure does not form a sequence i.e. each item or element is connected with two or more other items in a non-linear arrangement. The data elements are not arranged in sequential structure.</w:t>
+      </w:r>
+    </w:p>
+    <w:p>
+      <w:pPr>
+        <w:shd w:val="clear" w:color="auto" w:fill="FFFFFF"/>
+        <w:spacing w:line="240" w:lineRule="auto"/>
+        <w:jc w:val="both"/>
+        <w:rPr>
+          <w:rFonts w:ascii="Times New Roman" w:eastAsia="Times New Roman" w:hAnsi="Times New Roman" w:cs="Times New Roman"/>
+          <w:sz w:val="24"/>
+          <w:szCs w:val="24"/>
+        </w:rPr>
+      </w:pPr>
+      <w:r>
+        <w:rPr>
+          <w:rFonts w:ascii="Times New Roman" w:eastAsia="Times New Roman" w:hAnsi="Times New Roman" w:cs="Times New Roman"/>
+          <w:sz w:val="24"/>
+          <w:szCs w:val="24"/>
+        </w:rPr>
+        <w:t xml:space="preserve">Types of </w:t>
+      </w:r>
+      <w:proofErr w:type="gramStart"/>
+      <w:r>
+        <w:rPr>
+          <w:rFonts w:ascii="Times New Roman" w:eastAsia="Times New Roman" w:hAnsi="Times New Roman" w:cs="Times New Roman"/>
+          <w:sz w:val="24"/>
+          <w:szCs w:val="24"/>
+        </w:rPr>
+        <w:t>Non Linear</w:t>
+      </w:r>
+      <w:proofErr w:type="gramEnd"/>
+      <w:r>
+        <w:rPr>
+          <w:rFonts w:ascii="Times New Roman" w:eastAsia="Times New Roman" w:hAnsi="Times New Roman" w:cs="Times New Roman"/>
+          <w:sz w:val="24"/>
+          <w:szCs w:val="24"/>
+        </w:rPr>
+        <w:t xml:space="preserve"> Data Structures are given below:</w:t>
+      </w:r>
+    </w:p>
+    <w:p>
+      <w:pPr>
+        <w:shd w:val="clear" w:color="auto" w:fill="FFFFFF"/>
+        <w:spacing w:line="240" w:lineRule="auto"/>
+        <w:jc w:val="both"/>
+        <w:rPr>
+          <w:rFonts w:ascii="Times New Roman" w:eastAsia="Times New Roman" w:hAnsi="Times New Roman" w:cs="Times New Roman"/>
+          <w:sz w:val="24"/>
+          <w:szCs w:val="24"/>
+        </w:rPr>
+      </w:pPr>
+      <w:r>
+        <w:rPr>
+          <w:rFonts w:ascii="Times New Roman" w:eastAsia="Times New Roman" w:hAnsi="Times New Roman" w:cs="Times New Roman"/>
+          <w:b/>
+          <w:bCs/>
+          <w:sz w:val="24"/>
+          <w:szCs w:val="24"/>
+        </w:rPr>
+        <w:t>Trees:</w:t>
+      </w:r>
+      <w:r>
+        <w:rPr>
+          <w:rFonts w:ascii="Times New Roman" w:eastAsia="Times New Roman" w:hAnsi="Times New Roman" w:cs="Times New Roman"/>
+          <w:sz w:val="24"/>
+          <w:szCs w:val="24"/>
+        </w:rPr>
+        <w:t xml:space="preserve"> Trees are multilevel data structures with a hierarchical relationship among its elements known as nodes. The bottommost nodes in the </w:t>
       </w:r>
       <w:proofErr w:type="spellStart"/>
       <w:r>
@@ -1253,7 +1763,7 @@
           <w:sz w:val="24"/>
           <w:szCs w:val="24"/>
         </w:rPr>
-        <w:t>int</w:t>
+        <w:t>herierchy</w:t>
       </w:r>
       <w:proofErr w:type="spellEnd"/>
       <w:r>
@@ -1262,349 +1772,6 @@
           <w:sz w:val="24"/>
           <w:szCs w:val="24"/>
         </w:rPr>
-        <w:t>, float or double.</w:t>
-      </w:r>
-    </w:p>
-    <w:p>
-      <w:pPr>
-        <w:shd w:val="clear" w:color="auto" w:fill="FFFFFF"/>
-        <w:spacing w:line="240" w:lineRule="auto"/>
-        <w:jc w:val="both"/>
-        <w:rPr>
-          <w:rFonts w:ascii="Times New Roman" w:eastAsia="Times New Roman" w:hAnsi="Times New Roman" w:cs="Times New Roman"/>
-          <w:sz w:val="24"/>
-          <w:szCs w:val="24"/>
-        </w:rPr>
-      </w:pPr>
-      <w:r>
-        <w:rPr>
-          <w:rFonts w:ascii="Times New Roman" w:eastAsia="Times New Roman" w:hAnsi="Times New Roman" w:cs="Times New Roman"/>
-          <w:sz w:val="24"/>
-          <w:szCs w:val="24"/>
-        </w:rPr>
-        <w:t>The elements of array share the same variable name but each one carries a different index number known as subscript. The array can be one dimensional, two dimensional or multidimensional.</w:t>
-      </w:r>
-    </w:p>
-    <w:p>
-      <w:pPr>
-        <w:shd w:val="clear" w:color="auto" w:fill="FFFFFF"/>
-        <w:spacing w:line="240" w:lineRule="auto"/>
-        <w:jc w:val="both"/>
-        <w:rPr>
-          <w:rFonts w:ascii="Times New Roman" w:eastAsia="Times New Roman" w:hAnsi="Times New Roman" w:cs="Times New Roman"/>
-          <w:sz w:val="24"/>
-          <w:szCs w:val="24"/>
-        </w:rPr>
-      </w:pPr>
-      <w:r>
-        <w:rPr>
-          <w:rFonts w:ascii="Times New Roman" w:eastAsia="Times New Roman" w:hAnsi="Times New Roman" w:cs="Times New Roman"/>
-          <w:sz w:val="24"/>
-          <w:szCs w:val="24"/>
-        </w:rPr>
-        <w:t>The individual elements of the array age are:</w:t>
-      </w:r>
-    </w:p>
-    <w:p>
-      <w:pPr>
-        <w:shd w:val="clear" w:color="auto" w:fill="FFFFFF"/>
-        <w:spacing w:line="240" w:lineRule="auto"/>
-        <w:jc w:val="both"/>
-        <w:rPr>
-          <w:rFonts w:ascii="Times New Roman" w:eastAsia="Times New Roman" w:hAnsi="Times New Roman" w:cs="Times New Roman"/>
-          <w:sz w:val="24"/>
-          <w:szCs w:val="24"/>
-        </w:rPr>
-      </w:pPr>
-      <w:r>
-        <w:rPr>
-          <w:rFonts w:ascii="Times New Roman" w:eastAsia="Times New Roman" w:hAnsi="Times New Roman" w:cs="Times New Roman"/>
-          <w:sz w:val="24"/>
-          <w:szCs w:val="24"/>
-        </w:rPr>
-        <w:t>age[0], age[1], age[2], age[3],......... age[98], age[99].</w:t>
-      </w:r>
-    </w:p>
-    <w:p>
-      <w:pPr>
-        <w:shd w:val="clear" w:color="auto" w:fill="FFFFFF"/>
-        <w:spacing w:line="240" w:lineRule="auto"/>
-        <w:jc w:val="both"/>
-        <w:rPr>
-          <w:rFonts w:ascii="Times New Roman" w:eastAsia="Times New Roman" w:hAnsi="Times New Roman" w:cs="Times New Roman"/>
-          <w:sz w:val="24"/>
-          <w:szCs w:val="24"/>
-        </w:rPr>
-      </w:pPr>
-      <w:r>
-        <w:rPr>
-          <w:rFonts w:ascii="Times New Roman" w:eastAsia="Times New Roman" w:hAnsi="Times New Roman" w:cs="Times New Roman"/>
-          <w:b/>
-          <w:bCs/>
-          <w:sz w:val="24"/>
-          <w:szCs w:val="24"/>
-        </w:rPr>
-        <w:lastRenderedPageBreak/>
-        <w:t>Linked List:</w:t>
-      </w:r>
-      <w:r>
-        <w:rPr>
-          <w:rFonts w:ascii="Times New Roman" w:eastAsia="Times New Roman" w:hAnsi="Times New Roman" w:cs="Times New Roman"/>
-          <w:sz w:val="24"/>
-          <w:szCs w:val="24"/>
-        </w:rPr>
-        <w:t> Linked list is a linear data structure which is used to maintain a list in the memory. It can be seen as the collection of nodes stored at non-contiguous memory locations. Each node of the list contains a pointer to its adjacent node.</w:t>
-      </w:r>
-    </w:p>
-    <w:p>
-      <w:pPr>
-        <w:shd w:val="clear" w:color="auto" w:fill="FFFFFF"/>
-        <w:spacing w:line="240" w:lineRule="auto"/>
-        <w:jc w:val="both"/>
-        <w:rPr>
-          <w:rFonts w:ascii="Times New Roman" w:eastAsia="Times New Roman" w:hAnsi="Times New Roman" w:cs="Times New Roman"/>
-          <w:sz w:val="24"/>
-          <w:szCs w:val="24"/>
-        </w:rPr>
-      </w:pPr>
-      <w:r>
-        <w:rPr>
-          <w:rFonts w:ascii="Times New Roman" w:eastAsia="Times New Roman" w:hAnsi="Times New Roman" w:cs="Times New Roman"/>
-          <w:b/>
-          <w:bCs/>
-          <w:sz w:val="24"/>
-          <w:szCs w:val="24"/>
-        </w:rPr>
-        <w:t>Stack:</w:t>
-      </w:r>
-      <w:r>
-        <w:rPr>
-          <w:rFonts w:ascii="Times New Roman" w:eastAsia="Times New Roman" w:hAnsi="Times New Roman" w:cs="Times New Roman"/>
-          <w:sz w:val="24"/>
-          <w:szCs w:val="24"/>
-        </w:rPr>
-        <w:t> Stack is a linear list in which insertion and deletions are allowed only at one end, called </w:t>
-      </w:r>
-      <w:r>
-        <w:rPr>
-          <w:rFonts w:ascii="Times New Roman" w:eastAsia="Times New Roman" w:hAnsi="Times New Roman" w:cs="Times New Roman"/>
-          <w:b/>
-          <w:bCs/>
-          <w:sz w:val="24"/>
-          <w:szCs w:val="24"/>
-        </w:rPr>
-        <w:t>top</w:t>
-      </w:r>
-      <w:r>
-        <w:rPr>
-          <w:rFonts w:ascii="Times New Roman" w:eastAsia="Times New Roman" w:hAnsi="Times New Roman" w:cs="Times New Roman"/>
-          <w:sz w:val="24"/>
-          <w:szCs w:val="24"/>
-        </w:rPr>
-        <w:t>.</w:t>
-      </w:r>
-    </w:p>
-    <w:p>
-      <w:pPr>
-        <w:shd w:val="clear" w:color="auto" w:fill="FFFFFF"/>
-        <w:spacing w:line="240" w:lineRule="auto"/>
-        <w:jc w:val="both"/>
-        <w:rPr>
-          <w:rFonts w:ascii="Times New Roman" w:eastAsia="Times New Roman" w:hAnsi="Times New Roman" w:cs="Times New Roman"/>
-          <w:sz w:val="24"/>
-          <w:szCs w:val="24"/>
-        </w:rPr>
-      </w:pPr>
-      <w:r>
-        <w:rPr>
-          <w:rFonts w:ascii="Times New Roman" w:eastAsia="Times New Roman" w:hAnsi="Times New Roman" w:cs="Times New Roman"/>
-          <w:sz w:val="24"/>
-          <w:szCs w:val="24"/>
-        </w:rPr>
-        <w:t>A stack is an abstract data type (ADT), can be implemented in most of the programming languages. It is named as stack because it behaves like a real-world stack, for example: - piles of plates or deck of cards etc.</w:t>
-      </w:r>
-    </w:p>
-    <w:p>
-      <w:pPr>
-        <w:shd w:val="clear" w:color="auto" w:fill="FFFFFF"/>
-        <w:spacing w:line="240" w:lineRule="auto"/>
-        <w:jc w:val="both"/>
-        <w:rPr>
-          <w:rFonts w:ascii="Times New Roman" w:eastAsia="Times New Roman" w:hAnsi="Times New Roman" w:cs="Times New Roman"/>
-          <w:sz w:val="24"/>
-          <w:szCs w:val="24"/>
-        </w:rPr>
-      </w:pPr>
-      <w:r>
-        <w:rPr>
-          <w:rFonts w:ascii="Times New Roman" w:eastAsia="Times New Roman" w:hAnsi="Times New Roman" w:cs="Times New Roman"/>
-          <w:b/>
-          <w:bCs/>
-          <w:sz w:val="24"/>
-          <w:szCs w:val="24"/>
-        </w:rPr>
-        <w:t>Queue:</w:t>
-      </w:r>
-      <w:r>
-        <w:rPr>
-          <w:rFonts w:ascii="Times New Roman" w:eastAsia="Times New Roman" w:hAnsi="Times New Roman" w:cs="Times New Roman"/>
-          <w:sz w:val="24"/>
-          <w:szCs w:val="24"/>
-        </w:rPr>
-        <w:t> Queue is a linear list in which elements can be inserted only at one end called </w:t>
-      </w:r>
-      <w:r>
-        <w:rPr>
-          <w:rFonts w:ascii="Times New Roman" w:eastAsia="Times New Roman" w:hAnsi="Times New Roman" w:cs="Times New Roman"/>
-          <w:b/>
-          <w:bCs/>
-          <w:sz w:val="24"/>
-          <w:szCs w:val="24"/>
-        </w:rPr>
-        <w:t>rear</w:t>
-      </w:r>
-      <w:r>
-        <w:rPr>
-          <w:rFonts w:ascii="Times New Roman" w:eastAsia="Times New Roman" w:hAnsi="Times New Roman" w:cs="Times New Roman"/>
-          <w:sz w:val="24"/>
-          <w:szCs w:val="24"/>
-        </w:rPr>
-        <w:t> and deleted only at the other end called </w:t>
-      </w:r>
-      <w:r>
-        <w:rPr>
-          <w:rFonts w:ascii="Times New Roman" w:eastAsia="Times New Roman" w:hAnsi="Times New Roman" w:cs="Times New Roman"/>
-          <w:b/>
-          <w:bCs/>
-          <w:sz w:val="24"/>
-          <w:szCs w:val="24"/>
-        </w:rPr>
-        <w:t>front</w:t>
-      </w:r>
-      <w:r>
-        <w:rPr>
-          <w:rFonts w:ascii="Times New Roman" w:eastAsia="Times New Roman" w:hAnsi="Times New Roman" w:cs="Times New Roman"/>
-          <w:sz w:val="24"/>
-          <w:szCs w:val="24"/>
-        </w:rPr>
-        <w:t>.</w:t>
-      </w:r>
-    </w:p>
-    <w:p>
-      <w:pPr>
-        <w:shd w:val="clear" w:color="auto" w:fill="FFFFFF"/>
-        <w:spacing w:line="240" w:lineRule="auto"/>
-        <w:jc w:val="both"/>
-        <w:rPr>
-          <w:rFonts w:ascii="Times New Roman" w:eastAsia="Times New Roman" w:hAnsi="Times New Roman" w:cs="Times New Roman"/>
-          <w:sz w:val="24"/>
-          <w:szCs w:val="24"/>
-        </w:rPr>
-      </w:pPr>
-      <w:r>
-        <w:rPr>
-          <w:rFonts w:ascii="Times New Roman" w:eastAsia="Times New Roman" w:hAnsi="Times New Roman" w:cs="Times New Roman"/>
-          <w:sz w:val="24"/>
-          <w:szCs w:val="24"/>
-        </w:rPr>
-        <w:t>It is an abstract data structure, similar to stack. Queue is opened at both end therefore it follows First-In-First-Out (FIFO) methodology for storing the data items.</w:t>
-      </w:r>
-    </w:p>
-    <w:p>
-      <w:pPr>
-        <w:shd w:val="clear" w:color="auto" w:fill="FFFFFF"/>
-        <w:spacing w:line="240" w:lineRule="auto"/>
-        <w:jc w:val="both"/>
-        <w:rPr>
-          <w:rFonts w:ascii="Times New Roman" w:eastAsia="Times New Roman" w:hAnsi="Times New Roman" w:cs="Times New Roman"/>
-          <w:sz w:val="24"/>
-          <w:szCs w:val="24"/>
-        </w:rPr>
-      </w:pPr>
-      <w:r>
-        <w:rPr>
-          <w:rFonts w:ascii="Times New Roman" w:eastAsia="Times New Roman" w:hAnsi="Times New Roman" w:cs="Times New Roman"/>
-          <w:b/>
-          <w:bCs/>
-          <w:sz w:val="24"/>
-          <w:szCs w:val="24"/>
-        </w:rPr>
-        <w:t>Non Linear Data Structures:</w:t>
-      </w:r>
-      <w:r>
-        <w:rPr>
-          <w:rFonts w:ascii="Times New Roman" w:eastAsia="Times New Roman" w:hAnsi="Times New Roman" w:cs="Times New Roman"/>
-          <w:sz w:val="24"/>
-          <w:szCs w:val="24"/>
-        </w:rPr>
-        <w:t> This data structure does not form a sequence i.e. each item or element is connected with two or more other items in a non-linear arrangement. The data elements are not arranged in sequential structure.</w:t>
-      </w:r>
-    </w:p>
-    <w:p>
-      <w:pPr>
-        <w:shd w:val="clear" w:color="auto" w:fill="FFFFFF"/>
-        <w:spacing w:line="240" w:lineRule="auto"/>
-        <w:jc w:val="both"/>
-        <w:rPr>
-          <w:rFonts w:ascii="Times New Roman" w:eastAsia="Times New Roman" w:hAnsi="Times New Roman" w:cs="Times New Roman"/>
-          <w:sz w:val="24"/>
-          <w:szCs w:val="24"/>
-        </w:rPr>
-      </w:pPr>
-      <w:r>
-        <w:rPr>
-          <w:rFonts w:ascii="Times New Roman" w:eastAsia="Times New Roman" w:hAnsi="Times New Roman" w:cs="Times New Roman"/>
-          <w:sz w:val="24"/>
-          <w:szCs w:val="24"/>
-        </w:rPr>
-        <w:t>Types of Non Linear Data Structures are given below:</w:t>
-      </w:r>
-    </w:p>
-    <w:p>
-      <w:pPr>
-        <w:shd w:val="clear" w:color="auto" w:fill="FFFFFF"/>
-        <w:spacing w:line="240" w:lineRule="auto"/>
-        <w:jc w:val="both"/>
-        <w:rPr>
-          <w:rFonts w:ascii="Times New Roman" w:eastAsia="Times New Roman" w:hAnsi="Times New Roman" w:cs="Times New Roman"/>
-          <w:sz w:val="24"/>
-          <w:szCs w:val="24"/>
-        </w:rPr>
-      </w:pPr>
-      <w:r>
-        <w:rPr>
-          <w:rFonts w:ascii="Times New Roman" w:eastAsia="Times New Roman" w:hAnsi="Times New Roman" w:cs="Times New Roman"/>
-          <w:b/>
-          <w:bCs/>
-          <w:sz w:val="24"/>
-          <w:szCs w:val="24"/>
-        </w:rPr>
-        <w:t>Trees:</w:t>
-      </w:r>
-      <w:r>
-        <w:rPr>
-          <w:rFonts w:ascii="Times New Roman" w:eastAsia="Times New Roman" w:hAnsi="Times New Roman" w:cs="Times New Roman"/>
-          <w:sz w:val="24"/>
-          <w:szCs w:val="24"/>
-        </w:rPr>
-        <w:t xml:space="preserve"> Trees are multilevel data structures with a hierarchical relationship among its elements known as nodes. The bottommost nodes in the </w:t>
-      </w:r>
-      <w:proofErr w:type="spellStart"/>
-      <w:r>
-        <w:rPr>
-          <w:rFonts w:ascii="Times New Roman" w:eastAsia="Times New Roman" w:hAnsi="Times New Roman" w:cs="Times New Roman"/>
-          <w:sz w:val="24"/>
-          <w:szCs w:val="24"/>
-        </w:rPr>
-        <w:t>herierchy</w:t>
-      </w:r>
-      <w:proofErr w:type="spellEnd"/>
-      <w:r>
-        <w:rPr>
-          <w:rFonts w:ascii="Times New Roman" w:eastAsia="Times New Roman" w:hAnsi="Times New Roman" w:cs="Times New Roman"/>
-          <w:sz w:val="24"/>
-          <w:szCs w:val="24"/>
-        </w:rPr>
         <w:t xml:space="preserve"> are called </w:t>
       </w:r>
       <w:r>
@@ -1661,7 +1828,25 @@
           <w:sz w:val="24"/>
           <w:szCs w:val="24"/>
         </w:rPr>
-        <w:t xml:space="preserve">Tree data structure is based on the parent-child relationship among the nodes. Each node in the tree can have more than one children except the leaf nodes whereas each node can have </w:t>
+        <w:t xml:space="preserve">Tree data structure is based on the parent-child relationship among the nodes. Each node in the tree can have more than one </w:t>
+      </w:r>
+      <w:proofErr w:type="gramStart"/>
+      <w:r>
+        <w:rPr>
+          <w:rFonts w:ascii="Times New Roman" w:eastAsia="Times New Roman" w:hAnsi="Times New Roman" w:cs="Times New Roman"/>
+          <w:sz w:val="24"/>
+          <w:szCs w:val="24"/>
+        </w:rPr>
+        <w:t>children</w:t>
+      </w:r>
+      <w:proofErr w:type="gramEnd"/>
+      <w:r>
+        <w:rPr>
+          <w:rFonts w:ascii="Times New Roman" w:eastAsia="Times New Roman" w:hAnsi="Times New Roman" w:cs="Times New Roman"/>
+          <w:sz w:val="24"/>
+          <w:szCs w:val="24"/>
+        </w:rPr>
+        <w:t xml:space="preserve"> except the leaf nodes whereas each node can have </w:t>
       </w:r>
       <w:proofErr w:type="spellStart"/>
       <w:r>
@@ -1835,7 +2020,25 @@
           <w:sz w:val="24"/>
           <w:szCs w:val="24"/>
         </w:rPr>
-        <w:t xml:space="preserve"> If we need to calculate the average of the marks obtained by a student in 6 different subject, we need to traverse the complete array of marks and calculate the total sum, then we will </w:t>
+        <w:t xml:space="preserve"> If we need to calculate the average of the marks obtained by a student in 6 different </w:t>
+      </w:r>
+      <w:proofErr w:type="gramStart"/>
+      <w:r>
+        <w:rPr>
+          <w:rFonts w:ascii="Times New Roman" w:eastAsia="Times New Roman" w:hAnsi="Times New Roman" w:cs="Times New Roman"/>
+          <w:sz w:val="24"/>
+          <w:szCs w:val="24"/>
+        </w:rPr>
+        <w:t>subject</w:t>
+      </w:r>
+      <w:proofErr w:type="gramEnd"/>
+      <w:r>
+        <w:rPr>
+          <w:rFonts w:ascii="Times New Roman" w:eastAsia="Times New Roman" w:hAnsi="Times New Roman" w:cs="Times New Roman"/>
+          <w:sz w:val="24"/>
+          <w:szCs w:val="24"/>
+        </w:rPr>
+        <w:t xml:space="preserve">, we need to traverse the complete array of marks and calculate the total sum, then we will </w:t>
       </w:r>
       <w:proofErr w:type="spellStart"/>
       <w:r>
@@ -1911,8 +2114,10 @@
           <w:sz w:val="24"/>
           <w:szCs w:val="24"/>
         </w:rPr>
+        <w:lastRenderedPageBreak/>
         <w:t>If the size of data structure is </w:t>
       </w:r>
+      <w:proofErr w:type="gramStart"/>
       <w:r>
         <w:rPr>
           <w:rFonts w:ascii="Times New Roman" w:eastAsia="Times New Roman" w:hAnsi="Times New Roman" w:cs="Times New Roman"/>
@@ -1923,6 +2128,7 @@
         </w:rPr>
         <w:t>n</w:t>
       </w:r>
+      <w:proofErr w:type="gramEnd"/>
       <w:r>
         <w:rPr>
           <w:rFonts w:ascii="Times New Roman" w:eastAsia="Times New Roman" w:hAnsi="Times New Roman" w:cs="Times New Roman"/>
@@ -1970,6 +2176,7 @@
         <w:t>3) </w:t>
       </w:r>
       <w:proofErr w:type="spellStart"/>
+      <w:proofErr w:type="gramStart"/>
       <w:r>
         <w:rPr>
           <w:rFonts w:ascii="Times New Roman" w:eastAsia="Times New Roman" w:hAnsi="Times New Roman" w:cs="Times New Roman"/>
@@ -1989,6 +2196,7 @@
         <w:t>The</w:t>
       </w:r>
       <w:proofErr w:type="spellEnd"/>
+      <w:proofErr w:type="gramEnd"/>
       <w:r>
         <w:rPr>
           <w:rFonts w:ascii="Times New Roman" w:eastAsia="Times New Roman" w:hAnsi="Times New Roman" w:cs="Times New Roman"/>
@@ -2015,7 +2223,6 @@
           <w:sz w:val="24"/>
           <w:szCs w:val="24"/>
         </w:rPr>
-        <w:lastRenderedPageBreak/>
         <w:t>If we try to delete an element from an empty data structure then </w:t>
       </w:r>
       <w:r>
@@ -2705,6 +2912,7 @@
                 <w:sz w:val="24"/>
                 <w:szCs w:val="24"/>
               </w:rPr>
+              <w:lastRenderedPageBreak/>
               <w:t>6.</w:t>
             </w:r>
           </w:p>
@@ -2867,7 +3075,6 @@
           <w:sz w:val="28"/>
           <w:szCs w:val="28"/>
         </w:rPr>
-        <w:lastRenderedPageBreak/>
         <w:t xml:space="preserve">Algorithm </w:t>
       </w:r>
       <w:r>
@@ -3084,7 +3291,7 @@
 </file>
 
 <file path=word/numbering.xml><?xml version="1.0" encoding="utf-8"?>
-<w:numbering xmlns:wpc="http://schemas.microsoft.com/office/word/2010/wordprocessingCanvas" xmlns:cx="http://schemas.microsoft.com/office/drawing/2014/chartex" xmlns:cx1="http://schemas.microsoft.com/office/drawing/2015/9/8/chartex" xmlns:cx2="http://schemas.microsoft.com/office/drawing/2015/10/21/chartex" xmlns:cx3="http://schemas.microsoft.com/office/drawing/2016/5/9/chartex" xmlns:cx4="http://schemas.microsoft.com/office/drawing/2016/5/10/chartex" xmlns:cx5="http://schemas.microsoft.com/office/drawing/2016/5/11/chartex" xmlns:cx6="http://schemas.microsoft.com/office/drawing/2016/5/12/chartex" xmlns:cx7="http://schemas.microsoft.com/office/drawing/2016/5/13/chartex" xmlns:cx8="http://schemas.microsoft.com/office/drawing/2016/5/14/chartex" xmlns:mc="http://schemas.openxmlformats.org/markup-compatibility/2006" xmlns:aink="http://schemas.microsoft.com/office/drawing/2016/ink" xmlns:am3d="http://schemas.microsoft.com/office/drawing/2017/model3d" xmlns:o="urn:schemas-microsoft-com:office:office" xmlns:oel="http://schemas.microsoft.com/office/2019/extlst" xmlns:r="http://schemas.openxmlformats.org/officeDocument/2006/relationships" xmlns:m="http://schemas.openxmlformats.org/officeDocument/2006/math" xmlns:v="urn:schemas-microsoft-com:vml" xmlns:wp14="http://schemas.microsoft.com/office/word/2010/wordprocessingDrawing" xmlns:wp="http://schemas.openxmlformats.org/drawingml/2006/wordprocessingDrawing" xmlns:w10="urn:schemas-microsoft-com:office:word" xmlns:w="http://schemas.openxmlformats.org/wordprocessingml/2006/main" xmlns:w14="http://schemas.microsoft.com/office/word/2010/wordml" xmlns:w15="http://schemas.microsoft.com/office/word/2012/wordml" xmlns:w16cex="http://schemas.microsoft.com/office/word/2018/wordml/cex" xmlns:w16cid="http://schemas.microsoft.com/office/word/2016/wordml/cid" xmlns:w16="http://schemas.microsoft.com/office/word/2018/wordml" xmlns:w16sdtdh="http://schemas.microsoft.com/office/word/2020/wordml/sdtdatahash" xmlns:w16se="http://schemas.microsoft.com/office/word/2015/wordml/symex" xmlns:wpg="http://schemas.microsoft.com/office/word/2010/wordprocessingGroup" xmlns:wpi="http://schemas.microsoft.com/office/word/2010/wordprocessingInk" xmlns:wne="http://schemas.microsoft.com/office/word/2006/wordml" xmlns:wps="http://schemas.microsoft.com/office/word/2010/wordprocessingShape" mc:Ignorable="w14 w15 w16se w16cid w16 w16cex w16sdtdh wp14">
+<w:numbering xmlns:wpc="http://schemas.microsoft.com/office/word/2010/wordprocessingCanvas" xmlns:cx="http://schemas.microsoft.com/office/drawing/2014/chartex" xmlns:cx1="http://schemas.microsoft.com/office/drawing/2015/9/8/chartex" xmlns:cx2="http://schemas.microsoft.com/office/drawing/2015/10/21/chartex" xmlns:cx3="http://schemas.microsoft.com/office/drawing/2016/5/9/chartex" xmlns:cx4="http://schemas.microsoft.com/office/drawing/2016/5/10/chartex" xmlns:cx5="http://schemas.microsoft.com/office/drawing/2016/5/11/chartex" xmlns:cx6="http://schemas.microsoft.com/office/drawing/2016/5/12/chartex" xmlns:cx7="http://schemas.microsoft.com/office/drawing/2016/5/13/chartex" xmlns:cx8="http://schemas.microsoft.com/office/drawing/2016/5/14/chartex" xmlns:mc="http://schemas.openxmlformats.org/markup-compatibility/2006" xmlns:m="http://schemas.openxmlformats.org/officeDocument/2006/math" xmlns:aink="http://schemas.microsoft.com/office/drawing/2016/ink" xmlns:am3d="http://schemas.microsoft.com/office/drawing/2017/model3d" xmlns:oel="http://schemas.microsoft.com/office/2019/extlst" xmlns:r="http://schemas.openxmlformats.org/officeDocument/2006/relationships" xmlns:wp14="http://schemas.microsoft.com/office/word/2010/wordprocessingDrawing" xmlns:wp="http://schemas.openxmlformats.org/drawingml/2006/wordprocessingDrawing" xmlns:wpg="http://schemas.microsoft.com/office/word/2010/wordprocessingGroup" xmlns:wpi="http://schemas.microsoft.com/office/word/2010/wordprocessingInk" xmlns:wps="http://schemas.microsoft.com/office/word/2010/wordprocessingShape" xmlns:o="urn:schemas-microsoft-com:office:office" xmlns:v="urn:schemas-microsoft-com:vml" xmlns:w10="urn:schemas-microsoft-com:office:word" xmlns:w="http://schemas.openxmlformats.org/wordprocessingml/2006/main" xmlns:w14="http://schemas.microsoft.com/office/word/2010/wordml" xmlns:w15="http://schemas.microsoft.com/office/word/2012/wordml" xmlns:w16cex="http://schemas.microsoft.com/office/word/2018/wordml/cex" xmlns:w16cid="http://schemas.microsoft.com/office/word/2016/wordml/cid" xmlns:w16="http://schemas.microsoft.com/office/word/2018/wordml" xmlns:w16sdtdh="http://schemas.microsoft.com/office/word/2020/wordml/sdtdatahash" xmlns:w16sdtfl="http://schemas.microsoft.com/office/word/2024/wordml/sdtformatlock" xmlns:w16se="http://schemas.microsoft.com/office/word/2015/wordml/symex" xmlns:w16du="http://schemas.microsoft.com/office/word/2023/wordml/word16du" xmlns:wne="http://schemas.microsoft.com/office/word/2006/wordml" mc:Ignorable="w14 w15 w16se w16cid w16 w16cex w16sdtdh w16sdtfl w16du wp14">
   <w:abstractNum w:abstractNumId="0" w15:restartNumberingAfterBreak="0">
     <w:nsid w:val="49A20D14"/>
     <w:multiLevelType w:val="multilevel"/>
@@ -3241,7 +3448,7 @@
 </file>
 
 <file path=word/styles.xml><?xml version="1.0" encoding="utf-8"?>
-<w:styles xmlns:mc="http://schemas.openxmlformats.org/markup-compatibility/2006" xmlns:r="http://schemas.openxmlformats.org/officeDocument/2006/relationships" xmlns:w="http://schemas.openxmlformats.org/wordprocessingml/2006/main" xmlns:w14="http://schemas.microsoft.com/office/word/2010/wordml" xmlns:w15="http://schemas.microsoft.com/office/word/2012/wordml" xmlns:w16cex="http://schemas.microsoft.com/office/word/2018/wordml/cex" xmlns:w16cid="http://schemas.microsoft.com/office/word/2016/wordml/cid" xmlns:w16="http://schemas.microsoft.com/office/word/2018/wordml" xmlns:w16sdtdh="http://schemas.microsoft.com/office/word/2020/wordml/sdtdatahash" xmlns:w16se="http://schemas.microsoft.com/office/word/2015/wordml/symex" mc:Ignorable="w14 w15 w16se w16cid w16 w16cex w16sdtdh">
+<w:styles xmlns:mc="http://schemas.openxmlformats.org/markup-compatibility/2006" xmlns:r="http://schemas.openxmlformats.org/officeDocument/2006/relationships" xmlns:w="http://schemas.openxmlformats.org/wordprocessingml/2006/main" xmlns:w14="http://schemas.microsoft.com/office/word/2010/wordml" xmlns:w15="http://schemas.microsoft.com/office/word/2012/wordml" xmlns:w16cex="http://schemas.microsoft.com/office/word/2018/wordml/cex" xmlns:w16cid="http://schemas.microsoft.com/office/word/2016/wordml/cid" xmlns:w16="http://schemas.microsoft.com/office/word/2018/wordml" xmlns:w16sdtdh="http://schemas.microsoft.com/office/word/2020/wordml/sdtdatahash" xmlns:w16sdtfl="http://schemas.microsoft.com/office/word/2024/wordml/sdtformatlock" xmlns:w16se="http://schemas.microsoft.com/office/word/2015/wordml/symex" xmlns:w16du="http://schemas.microsoft.com/office/word/2023/wordml/word16du" mc:Ignorable="w14 w15 w16se w16cid w16 w16cex w16sdtdh w16sdtfl w16du">
   <w:docDefaults>
     <w:rPrDefault>
       <w:rPr>

</xml_diff>